<commit_message>
court(va): answering brief gated on the shared model (docx reported: LibreOffice note placement), closing kept with the last paragraph (fb-595.54.35)
Co-Authored-By: Claude Opus 5.5 <noreply@anthropic.com>
</commit_message>
<xml_diff>
--- a/courts/fourth-circuit/virginia/state/supreme-court/answering-brief/usage/OUTPUT-answering-brief.docx
+++ b/courts/fourth-circuit/virginia/state/supreme-court/answering-brief/usage/OUTPUT-answering-brief.docx
@@ -1993,7 +1993,7 @@
         <w:tab/>
       </w:r>
       <w:r>
-        <w:t xml:space="preserve">43</w:t>
+        <w:t xml:space="preserve">44</w:t>
       </w:r>
     </w:p>
     <w:p>
@@ -10380,25 +10380,7 @@
         <w:t xml:space="preserve"> </w:t>
       </w:r>
       <w:r>
-        <w:t xml:space="preserve">Anderson’s attempted escape from prison, an Albemarle County jury convicted him of two counts of assaulting and battering correctional officers, in violation of Code § 18.2</w:t>
-      </w:r>
-      <w:r>
-        <w:noBreakHyphen/>
-      </w:r>
-      <w:r>
-        <w:t xml:space="preserve">57(C); abduction of a correctional officer by a prisoner, in violation of Code § 18.2</w:t>
-      </w:r>
-      <w:r>
-        <w:noBreakHyphen/>
-      </w:r>
-      <w:r>
-        <w:t xml:space="preserve">48.1; and attempted escape, in violation of Code § 18.2</w:t>
-      </w:r>
-      <w:r>
-        <w:noBreakHyphen/>
-      </w:r>
-      <w:r>
-        <w:t xml:space="preserve">478. JA13–14; see</w:t>
+        <w:t xml:space="preserve">Anderson’s attempted escape from prison, an Albemarle County jury convicted him of two counts of assaulting and battering correctional officers, in violation of Code § 18.2-⁠57(C); abduction of a correctional officer by a prisoner, in violation of Code § 18.2-⁠48.1; and attempted escape, in violation of Code § 18.2-⁠478. JA13–14; see</w:t>
       </w:r>
       <w:r>
         <w:t xml:space="preserve"> </w:t>
@@ -10529,13 +10511,7 @@
         <w:tab/>
       </w:r>
       <w:r>
-        <w:t xml:space="preserve">The circuit court erred in holding that Budget Item 404(R)⁠(2) applies to the Petitioner and that therefore Petitioner is not entitled to enhanced sentence credits under Va. Code Ann. § 53.1</w:t>
-      </w:r>
-      <w:r>
-        <w:noBreakHyphen/>
-      </w:r>
-      <w:r>
-        <w:t xml:space="preserve">202.3</w:t>
+        <w:t xml:space="preserve">The circuit court erred in holding that Budget Item 404(R)⁠(2) applies to the Petitioner and that therefore Petitioner is not entitled to enhanced sentence credits under Va. Code Ann. § 53.1-⁠202.3</w:t>
       </w:r>
       <w:r>
         <w:t xml:space="preserve"> </w:t>
@@ -10907,13 +10883,13 @@
         <w:noBreakHyphen/>
       </w:r>
       <w:r>
-        <w:t xml:space="preserve">00030, Plea Agreement at 1–3 (W.D. Va. May</w:t>
-      </w:r>
-      <w:r>
-        <w:t xml:space="preserve"> </w:t>
-      </w:r>
-      <w:r>
-        <w:t xml:space="preserve">12, 2005), ECF No. 166.</w:t>
+        <w:t xml:space="preserve">00030, Plea Agreement</w:t>
+      </w:r>
+      <w:r>
+        <w:t xml:space="preserve"> </w:t>
+      </w:r>
+      <w:r>
+        <w:t xml:space="preserve">at 1–3 (W.D. Va. May 12, 2005), ECF No. 166.</w:t>
       </w:r>
     </w:p>
     <w:p>
@@ -11215,13 +11191,13 @@
         <w:noBreakHyphen/>
       </w:r>
       <w:r>
-        <w:t xml:space="preserve">00030, Plea Agreement at 1–3 (W.D. Va. May</w:t>
-      </w:r>
-      <w:r>
-        <w:t xml:space="preserve"> </w:t>
-      </w:r>
-      <w:r>
-        <w:t xml:space="preserve">12, 2005), ECF No. 166;</w:t>
+        <w:t xml:space="preserve">00030, Plea Agreement</w:t>
+      </w:r>
+      <w:r>
+        <w:t xml:space="preserve"> </w:t>
+      </w:r>
+      <w:r>
+        <w:t xml:space="preserve">at 1–3 (W.D. Va. May 12, 2005), ECF No. 166;</w:t>
       </w:r>
       <w:r>
         <w:t xml:space="preserve"> </w:t>
@@ -11240,13 +11216,7 @@
         <w:noBreakHyphen/>
       </w:r>
       <w:r>
-        <w:t xml:space="preserve">00030, Judgment at 1 (W.D. Va. Mar. 28,</w:t>
-      </w:r>
-      <w:r>
-        <w:t xml:space="preserve"> </w:t>
-      </w:r>
-      <w:r>
-        <w:t xml:space="preserve">2006), ECF No. 206. Anderson began serving his federal sentence in April 2006. JA4. When Anderson completed the federal sentence, he began serving his Virginia sentences on January 18, 2013. JA4, 75.</w:t>
+        <w:t xml:space="preserve">00030, Judgment at 1 (W.D. Va. Mar. 28, 2006), ECF No. 206. Anderson began serving his federal sentence in April 2006. JA4. When Anderson completed the federal sentence, he began serving his Virginia sentences on January 18, 2013. JA4, 75.</w:t>
       </w:r>
     </w:p>
     <w:p>
@@ -11452,13 +11422,7 @@
         <w:pStyle w:val="BodyText"/>
       </w:pPr>
       <w:r>
-        <w:t xml:space="preserve">Virginia has long allowed inmates serving certain sentences to earn credit for good behavior during their incarceration, thereby reducing the length of their sentences. Code § 53.1</w:t>
-      </w:r>
-      <w:r>
-        <w:noBreakHyphen/>
-      </w:r>
-      <w:r>
-        <w:t xml:space="preserve">202.2</w:t>
+        <w:t xml:space="preserve">Virginia has long allowed inmates serving certain sentences to earn credit for good behavior during their incarceration, thereby reducing the length of their sentences. Code § 53.1-⁠202.2</w:t>
       </w:r>
       <w:r>
         <w:t xml:space="preserve"> </w:t>
@@ -11471,13 +11435,7 @@
         <w:t xml:space="preserve">et seq.</w:t>
       </w:r>
       <w:r>
-        <w:t xml:space="preserve">; see generally JA19 (describing the various “good time” award systems VDOC administers). Different credit systems apply to different sentences, depending on the type, date, and severity of the offense. JA19. The system in place at the time Anderson was sentenced—called the earned sentence credit program—applies to inmates who committed felony offenses on or after January 1, 1995. JA19. When Anderson was sentenced, he was eligible to earn a maximum of 4.5 credit days for every 30 days served. Code § 53.1</w:t>
-      </w:r>
-      <w:r>
-        <w:noBreakHyphen/>
-      </w:r>
-      <w:r>
-        <w:t xml:space="preserve">202.3</w:t>
+        <w:t xml:space="preserve">; see generally JA19 (describing the various “good time” award systems VDOC administers). Different credit systems apply to different sentences, depending on the type, date, and severity of the offense. JA19. The system in place at the time Anderson was sentenced—called the earned sentence credit program—applies to inmates who committed felony offenses on or after January 1, 1995. JA19. When Anderson was sentenced, he was eligible to earn a maximum of 4.5 credit days for every 30 days served. Code § 53.1-⁠202.3</w:t>
       </w:r>
       <w:r>
         <w:t xml:space="preserve"> </w:t>
@@ -11497,13 +11455,7 @@
         <w:t xml:space="preserve"> </w:t>
       </w:r>
       <w:r>
-        <w:t xml:space="preserve">(Spec. Sess. I 2020), https://​tinyurl.​com/​yvj7nfpj. H.B. 5148 amended Code § 53.1</w:t>
-      </w:r>
-      <w:r>
-        <w:noBreakHyphen/>
-      </w:r>
-      <w:r>
-        <w:t xml:space="preserve">202.3</w:t>
+        <w:t xml:space="preserve">(Spec. Sess. I 2020), https://​tinyurl.​com/​yvj7nfpj. H.B. 5148 amended Code § 53.1-⁠202.3</w:t>
       </w:r>
       <w:r>
         <w:t xml:space="preserve"> </w:t>
@@ -11583,19 +11535,10 @@
         <w:t xml:space="preserve"> </w:t>
       </w:r>
       <w:r>
-        <w:t xml:space="preserve">(2022 Spec. Sess. I), https://​tinyurl.​com/​2s4e5kpc. Item 404(R)⁠(2) stated that, “[n]otwithstanding the provisions of § 53.1</w:t>
-      </w:r>
-      <w:r>
-        <w:noBreakHyphen/>
-      </w:r>
-      <w:r>
-        <w:t xml:space="preserve">202.3</w:t>
-      </w:r>
-      <w:r>
-        <w:t xml:space="preserve"> </w:t>
-      </w:r>
-      <w:r>
-        <w:t xml:space="preserve">. . . a maximum of 4.5 sentence credits may be earned for each 30 days served on a sentence that is concurrent with or consecutive to a sentence for a conviction of an offense enumerated in subsection A.” 2022 Acts ch. 2,</w:t>
+        <w:t xml:space="preserve">(2022 Spec. Sess. I), https://​tinyurl.​com/​2s4e5kpc. Item 404(R)⁠(2) stated that, “[n]otwithstanding the provisions of § 53.1-⁠202.3</w:t>
+      </w:r>
+      <w:r>
+        <w:t xml:space="preserve"> . . . a maximum of 4.5 sentence credits may be earned for each 30 days served on a sentence that is concurrent with or consecutive to a sentence for a conviction of an offense enumerated in subsection A.” 2022 Acts ch. 2,</w:t>
       </w:r>
       <w:r>
         <w:t xml:space="preserve"> </w:t>
@@ -11609,13 +11552,7 @@
         <w:pStyle w:val="BodyText"/>
       </w:pPr>
       <w:r>
-        <w:t xml:space="preserve">Thus, Item 404(R)⁠(2) provides that H.B. 5148 will not increase the maximum sentence credits available for an inmate with a mixed sentence—that is, an inmate serving a sentence for at least one offense enumerated in subsection A of Code § 53.1</w:t>
-      </w:r>
-      <w:r>
-        <w:noBreakHyphen/>
-      </w:r>
-      <w:r>
-        <w:t xml:space="preserve">202.3,</w:t>
+        <w:t xml:space="preserve">Thus, Item 404(R)⁠(2) provides that H.B. 5148 will not increase the maximum sentence credits available for an inmate with a mixed sentence—that is, an inmate serving a sentence for at least one offense enumerated in subsection A of Code § 53.1-⁠202.3,</w:t>
       </w:r>
       <w:r>
         <w:t xml:space="preserve"> </w:t>
@@ -11743,13 +11680,7 @@
         <w:pStyle w:val="BodyText"/>
       </w:pPr>
       <w:r>
-        <w:t xml:space="preserve">Anderson has been earning 4.5 days of credit for every 30 days served since he became a VDOC inmate. JA75; see Code § 53.1</w:t>
-      </w:r>
-      <w:r>
-        <w:noBreakHyphen/>
-      </w:r>
-      <w:r>
-        <w:t xml:space="preserve">202.3</w:t>
+        <w:t xml:space="preserve">Anderson has been earning 4.5 days of credit for every 30 days served since he became a VDOC inmate. JA75; see Code § 53.1-⁠202.3</w:t>
       </w:r>
       <w:r>
         <w:t xml:space="preserve"> </w:t>
@@ -11763,13 +11694,7 @@
         <w:pStyle w:val="BodyTextNote"/>
       </w:pPr>
       <w:r>
-        <w:t xml:space="preserve">After H.B. 5148 and Item 404(R)⁠(2) became effective, Anderson filed a petition for a writ of habeas corpus in Albemarle Circuit Court against Harold Clarke, VDOC’s Director, and Kemsy Bowles, the Warden of Coffeewood Correctional Center where Anderson is presently incarcerated. JA1–57. Anderson asserted that, although his felony abduction conviction is enumerated in subsection A of Code § 53.1</w:t>
-      </w:r>
-      <w:r>
-        <w:noBreakHyphen/>
-      </w:r>
-      <w:r>
-        <w:t xml:space="preserve">202.3</w:t>
+        <w:t xml:space="preserve">After H.B. 5148 and Item 404(R)⁠(2) became effective, Anderson filed a petition for a writ of habeas corpus in Albemarle Circuit Court against Harold Clarke, VDOC’s Director, and Kemsy Bowles, the Warden of Coffeewood Correctional Center where Anderson is presently incarcerated. JA1–57. Anderson asserted that, although his felony abduction conviction is enumerated in subsection A of Code § 53.1-⁠202.3</w:t>
       </w:r>
       <w:r>
         <w:t xml:space="preserve"> </w:t>
@@ -11795,19 +11720,7 @@
         <w:pStyle w:val="BodyText"/>
       </w:pPr>
       <w:r>
-        <w:t xml:space="preserve">The circuit court granted Clarke and Bowles’s motion to dismiss. JA122–27. The circuit court held that the General Assembly’s changes to the earned sentence credit program “must be read in combination, including the implementation language of HB5148,” so any “additional retroactive language” in Item 404(R)⁠(2) would have been “unnecessary” and “redundant of HB5148’s implementation clause.” JA135; see JA124 (“[L]anguage that [Item 404(R)⁠(2)] would be applied retroactively was not necessary and would have been duplicative.”). It held that Anderson remained eligible to earn a maximum of 4.5 days of credit for every 30 days served on all of his sentences because he was convicted of an offense—abduction of correctional officer Joseph Woodson, in violation of Code § 18.2</w:t>
-      </w:r>
-      <w:r>
-        <w:noBreakHyphen/>
-      </w:r>
-      <w:r>
-        <w:t xml:space="preserve">48.1—enumerated in subsection A of Code § 53.1</w:t>
-      </w:r>
-      <w:r>
-        <w:noBreakHyphen/>
-      </w:r>
-      <w:r>
-        <w:t xml:space="preserve">202.3.</w:t>
+        <w:t xml:space="preserve">The circuit court granted Clarke and Bowles’s motion to dismiss. JA122–27. The circuit court held that the General Assembly’s changes to the earned sentence credit program “must be read in combination, including the implementation language of HB5148,” so any “additional retroactive language” in Item 404(R)⁠(2) would have been “unnecessary” and “redundant of HB5148’s implementation clause.” JA135; see JA124 (“[L]anguage that [Item 404(R)⁠(2)] would be applied retroactively was not necessary and would have been duplicative.”). It held that Anderson remained eligible to earn a maximum of 4.5 days of credit for every 30 days served on all of his sentences because he was convicted of an offense—abduction of correctional officer Joseph Woodson, in violation of Code § 18.2-⁠48.1—⁠enumerated in subsection A of Code § 53.1-⁠202.3.</w:t>
       </w:r>
       <w:r>
         <w:t xml:space="preserve"> </w:t>
@@ -11821,7 +11734,7 @@
         <w:pStyle w:val="BodyText"/>
       </w:pPr>
       <w:r>
-        <w:t xml:space="preserve">The circuit court further held that “[n]either HB5148 nor Budget Item 404(R)⁠(2) created a vested or substantive right before their effective date of July 1, 2022.” JA135. The court explained that “[u]ntil this provision became effective, it is not something the Court determines to be a vested or substantive right, and that makes it significantly different from the other cases that were cited by Mr. Anderson as those all involved statutes [that] . . . were effective.” JA123.</w:t>
+        <w:t xml:space="preserve">The circuit court further held that “[n]either HB5148 nor Budget Item 404(R)⁠(2) created a vested or substantive right before their effective date of July 1, 2022.” JA135. The court explained that “[u]ntil this provision became effective, it is not something the Court determines to be a vested or substantive right, and that makes it significantly different from the other cases that were cited by Mr. Anderson as those all involved statutes [that] . . . were effective.” JA123.</w:t>
       </w:r>
     </w:p>
     <w:p>
@@ -11979,13 +11892,7 @@
         <w:pStyle w:val="BodyText"/>
       </w:pPr>
       <w:r>
-        <w:t xml:space="preserve">Under the plain language of Item 404(R)⁠(2), Anderson remains eligible for a maximum of 4.5 days of earned credit for every 30 days served because he abducted a correctional officer, an offense enumerated in subsection A of Code § 53.1</w:t>
-      </w:r>
-      <w:r>
-        <w:noBreakHyphen/>
-      </w:r>
-      <w:r>
-        <w:t xml:space="preserve">202.3.</w:t>
+        <w:t xml:space="preserve">Under the plain language of Item 404(R)⁠(2), Anderson remains eligible for a maximum of 4.5 days of earned credit for every 30 days served because he abducted a correctional officer, an offense enumerated in subsection A of Code § 53.1-⁠202.3.</w:t>
       </w:r>
       <w:r>
         <w:t xml:space="preserve"> </w:t>
@@ -12726,25 +12633,13 @@
         <w:t xml:space="preserve"> </w:t>
       </w:r>
       <w:r>
-        <w:t xml:space="preserve">Anderson was convicted of felony abduction of a correctional officer, and subsection A enumerates “any kidnapping or abduction felony.” Code § 53.1</w:t>
-      </w:r>
-      <w:r>
-        <w:noBreakHyphen/>
-      </w:r>
-      <w:r>
-        <w:t xml:space="preserve">202.3(A)⁠(5).</w:t>
-      </w:r>
-      <w:r>
-        <w:t xml:space="preserve"> </w:t>
-      </w:r>
-      <w:r>
-        <w:t xml:space="preserve">And Item 404(R)⁠(2)’s non obstante clause further clarifies that the 4.5 credit maximum applies “[n]otwithstanding the provisions of § 53.1</w:t>
-      </w:r>
-      <w:r>
-        <w:noBreakHyphen/>
-      </w:r>
-      <w:r>
-        <w:t xml:space="preserve">202.3.”</w:t>
+        <w:t xml:space="preserve">Anderson was convicted of felony abduction of a correctional officer, and subsection A enumerates “any kidnapping or abduction felony.” Code § 53.1-⁠202.3(A)⁠(5).</w:t>
+      </w:r>
+      <w:r>
+        <w:t xml:space="preserve"> </w:t>
+      </w:r>
+      <w:r>
+        <w:t xml:space="preserve">And Item 404(R)⁠(2)’s non obstante clause further clarifies that the 4.5 credit maximum applies “[n]otwithstanding the provisions of § 53.1-⁠202.3.”</w:t>
       </w:r>
       <w:r>
         <w:t xml:space="preserve"> </w:t>
@@ -13021,7 +12916,7 @@
         <w:t xml:space="preserve"> </w:t>
       </w:r>
       <w:r>
-        <w:t xml:space="preserve">810, 814 (1953). “Indeed, where a statute does not become operative immediately on its enactment, but the time of its going into effect is postponed until a later date . . . it ordinarily does not have</w:t>
+        <w:t xml:space="preserve">810, 814 (1953). “Indeed, where a statute does not become operative immediately on its enactment, but the time of its going into effect is postponed until a later date . . . it ordinarily does not have</w:t>
       </w:r>
       <w:r>
         <w:t xml:space="preserve"> </w:t>
@@ -13053,7 +12948,7 @@
         <w:t xml:space="preserve"> </w:t>
       </w:r>
       <w:r>
-        <w:t xml:space="preserve">(emphasis added); see also 2 Sutherland, § 33:5 (“The power to enact laws includes the power to fix a future effective date. . . . A statute with a definite future commencement day has effect only from that date, no matter when it was enacted.”);</w:t>
+        <w:t xml:space="preserve">(emphasis added); see also 2 Sutherland, § 33:5 (“The power to enact laws includes the power to fix a future effective date. . . . A statute with a definite future commencement day has effect only from that date, no matter when it was enacted.”);</w:t>
       </w:r>
       <w:r>
         <w:t xml:space="preserve"> </w:t>
@@ -13080,7 +12975,7 @@
         <w:pStyle w:val="BodyText"/>
       </w:pPr>
       <w:r>
-        <w:t xml:space="preserve">Thus, as the U.S. Court of Appeals for the Tenth Circuit has explained, when “a law . . . was adopted, but repealed before its effective date,” it has no effect and confers no rights, because the status quo remains “until the Act became effective—which it never did[.]”</w:t>
+        <w:t xml:space="preserve">Thus, as the U.S. Court of Appeals for the Tenth Circuit has explained, when “a law . . . was adopted, but repealed before its effective date,” it has no effect and confers no rights, because the status quo remains “until the Act became effective—which it never did[.]”</w:t>
       </w:r>
       <w:r>
         <w:t xml:space="preserve"> </w:t>
@@ -13905,13 +13800,7 @@
         <w:pStyle w:val="BodyText"/>
       </w:pPr>
       <w:r>
-        <w:t xml:space="preserve">Here, the General Assembly’s intent for Item 404(R)⁠(2) to apply to the entirety of mixed sentences is clear from the context of the legislature’s amendments to the statutory scheme. The General Assembly enacted both H.B. 5148 and Item 404(R)⁠(2) as part of a comprehensive legislative process to alter the earned sentence credit program in Code § 53.1</w:t>
-      </w:r>
-      <w:r>
-        <w:noBreakHyphen/>
-      </w:r>
-      <w:r>
-        <w:t xml:space="preserve">202.3</w:t>
+        <w:t xml:space="preserve">Here, the General Assembly’s intent for Item 404(R)⁠(2) to apply to the entirety of mixed sentences is clear from the context of the legislature’s amendments to the statutory scheme. The General Assembly enacted both H.B. 5148 and Item 404(R)⁠(2) as part of a comprehensive legislative process to alter the earned sentence credit program in Code § 53.1-⁠202.3</w:t>
       </w:r>
       <w:r>
         <w:t xml:space="preserve"> </w:t>
@@ -13971,7 +13860,7 @@
         <w:t xml:space="preserve"> </w:t>
       </w:r>
       <w:r>
-        <w:t xml:space="preserve">Debate at 5:37:49 to 5:43:43, Jun. 17, 2022, Va. Gen. Assem. (2022 Spec. Sess. I), https://​tinyurl.​com/​4krmkew2 (statement of Sen. Mark Obenshain) (“I remember while we were debating [H.B. 5148 in 2020] that there was a great deal of discussion over who would and would not be eligible for those credits. We spent a lot of time talking about whether violent offenders—the worst of the worst—would be eligible for these earned sentence credits, and it was the consensus of this body that they should not be. . . . We spent a great deal of effort making sure that people who were convicted of those offenses were not eligible, but because of the way that this was drafted, this is a loophole that we should close. We have an obligation to do what we set out to do during that 2020 session and limit this and carefully cabin [earned sentence credit eligibility] to those who we agreed and linked arms and said should be eligible for these credits. . . . [T]his [amendment] corrects that.”). The legislative context makes clear that Item 404(R)⁠(2) was part of the same ongoing effort to revise the earned sentence credit regime that gave rise to H.B. 5148. Thus, as the circuit court correctly held, additional enactment language would have been “redundant.” JA135.</w:t>
+        <w:t xml:space="preserve">Debate at 5:37:49 to 5:43:43, Jun. 17, 2022, Va. Gen. Assem. (2022 Spec. Sess. I), https://​tinyurl.​com/​4krmkew2 (statement of Sen. Mark Obenshain) (“I remember while we were debating [H.B. 5148 in 2020] that there was a great deal of discussion over who would and would not be eligible for those credits. We spent a lot of time talking about whether violent offenders—the worst of the worst—would be eligible for these earned sentence credits, and it was the consensus of this body that they should not be. . . . We spent a great deal of effort making sure that people who were convicted of those offenses were not eligible, but because of the way that this was drafted, this is a loophole that we should close. We have an obligation to do what we set out to do during that 2020 session and limit this and carefully cabin [earned sentence credit eligibility] to those who we agreed and linked arms and said should be eligible for these credits. . . . [T]his [amendment] corrects that.”). The legislative context makes clear that Item 404(R)⁠(2) was part of the same ongoing effort to revise the earned sentence credit regime that gave rise to H.B. 5148. Thus, as the circuit court correctly held, additional enactment language would have been “redundant.” JA135.</w:t>
       </w:r>
     </w:p>
     <w:p>
@@ -14094,7 +13983,7 @@
         <w:t xml:space="preserve"> </w:t>
       </w:r>
       <w:r>
-        <w:t xml:space="preserve">Debate at 5:39:11 to 5:43:43, Jun. 17, 2022, Va. Gen. Assem. (2022 Spec. Sess. I), https://​tinyurl.​com/​4krmkew2 (statement of Sen. Mark Obenshain) (“That bill when it was adopted I believe inadvertently provided eligibility to people who were convicted concurrently of offenses that were covered and offenses that were not covered [under subsection A]. . . . Because of the legislation that we passed and without this amendment, we are going to be releasing 43 murderers and 41 rapists who would not be eligible to be released at the beginning of next month without that legislation, and this [amendment] corrects that.”). Instead, Anderson argues that the incoherence of his interpretation is solely a “policy” issue, which this Court cannot consider. Opening Br. 27–28. But Anderson’s argument that the presumption against retroactivity compels this bizarre result fails, see Part I.A,</w:t>
+        <w:t xml:space="preserve">Debate at 5:39:11 to 5:43:43, Jun. 17, 2022, Va. Gen. Assem. (2022 Spec. Sess. I), https://​tinyurl.​com/​4krmkew2 (statement of Sen. Mark Obenshain) (“That bill when it was adopted I believe inadvertently provided eligibility to people who were convicted concurrently of offenses that were covered and offenses that were not covered [under subsection A]. . . . Because of the legislation that we passed and without this amendment, we are going to be releasing 43 murderers and 41 rapists who would not be eligible to be released at the beginning of next month without that legislation, and this [amendment] corrects that.”). Instead, Anderson argues that the incoherence of his interpretation is solely a “policy” issue, which this Court cannot consider. Opening Br. 27–28. But Anderson’s argument that the presumption against retroactivity compels this bizarre result fails, see Part I.A,</w:t>
       </w:r>
       <w:r>
         <w:t xml:space="preserve"> </w:t>
@@ -14719,7 +14608,7 @@
         <w:pStyle w:val="BodyTextNote"/>
       </w:pPr>
       <w:r>
-        <w:t xml:space="preserve">The application of Item 404(R)⁠(2) to Anderson complies with the Ex Post Facto Clause. The U.S. Constitution provides that no “ex post facto law shall be passed,” and that “[n]o State shall . . . pass any . . . ex post facto law.” U.S. Const. art. I §§</w:t>
+        <w:t xml:space="preserve">The application of Item 404(R)⁠(2) to Anderson complies with the Ex Post Facto Clause. The U.S. Constitution provides that no “ex post facto law shall be passed,” and that “[n]o State shall . . . pass any . . . ex post facto law.” U.S. Const. art. I §§</w:t>
       </w:r>
       <w:r>
         <w:t xml:space="preserve"> 9, 10.</w:t>
@@ -15737,7 +15626,7 @@
         <w:t xml:space="preserve"> </w:t>
       </w:r>
       <w:r>
-        <w:t xml:space="preserve">Clause . . . bars application of a law ‘that changes the punishment, and inflicts a greater punishment, than the law annexed to the crime, when committed’” (quoting</w:t>
+        <w:t xml:space="preserve">Clause . . . bars application of a law ‘that changes the punishment, and inflicts a greater punishment, than the law annexed to the crime, when committed’” (quoting</w:t>
       </w:r>
       <w:r>
         <w:t xml:space="preserve"> </w:t>
@@ -16695,7 +16584,7 @@
         <w:t xml:space="preserve"> </w:t>
       </w:r>
       <w:r>
-        <w:t xml:space="preserve">164, 176 (4th Cir. 2010) (“[T]he Ex Post Facto Clause” controls “retroactive application of penal statutes” in “the criminal context,” while “in the civil context, retroactive application of statutes potentially implicates . . . the Due Process Clause.”). Thus, “whatever protection against retroactive legislative acts the Due Process Clause provides, . . . this protection is no greater than the protection provided by the Ex Post Facto Clause.”</w:t>
+        <w:t xml:space="preserve">164, 176 (4th Cir. 2010) (“[T]he Ex Post Facto Clause” controls “retroactive application of penal statutes” in “the criminal context,” while “in the civil context, retroactive application of statutes potentially implicates . . . the Due Process Clause.”). Thus, “whatever protection against retroactive legislative acts the Due Process Clause provides, . . . this protection is no greater than the protection provided by the Ex Post Facto Clause.”</w:t>
       </w:r>
       <w:r>
         <w:t xml:space="preserve"> </w:t>
@@ -16946,7 +16835,7 @@
         <w:t xml:space="preserve"> </w:t>
       </w:r>
       <w:r>
-        <w:t xml:space="preserve">716, 717, 719 (10th Cir. 2020) (“Parker argued the Act created a vested right that . . . could not be repealed—though the legislature repealed the Act before it took effect. . . . [B]ecause the Oklahoma legislature repealed the Act before its effective date . . . we have held that the Act did not create any federal constitutional claims for those seeking habeas relief.”) (internal quotation marks omitted);</w:t>
+        <w:t xml:space="preserve">716, 717, 719 (10th Cir. 2020) (“Parker argued the Act created a vested right that . . . could not be repealed—though the legislature repealed the Act before it took effect. . . . [B]ecause the Oklahoma legislature repealed the Act before its effective date . . . we have held that the Act did not create any federal constitutional claims for those seeking habeas relief.”) (internal quotation marks omitted);</w:t>
       </w:r>
       <w:r>
         <w:t xml:space="preserve"> </w:t>
@@ -17684,7 +17573,7 @@
         <w:t xml:space="preserve"> </w:t>
       </w:r>
       <w:r>
-        <w:t xml:space="preserve">750, 754 (1976) (“The first inquiry [in a procedural due process challenge] is whether the interest is . . . protected by procedural due process guarantees; if so, the second is whether the procedures prescribed or applied are sufficient to satisfy the due process “fairness” standard.”).</w:t>
+        <w:t xml:space="preserve">750, 754 (1976) (“The first inquiry [in a procedural due process challenge] is whether the interest is . . . protected by procedural due process guarantees; if so, the second is whether the procedures prescribed or applied are sufficient to satisfy the due process “fairness” standard.”).</w:t>
       </w:r>
     </w:p>
     <w:p>
@@ -17845,13 +17734,7 @@
         <w:t xml:space="preserve"> </w:t>
       </w:r>
       <w:r>
-        <w:t xml:space="preserve">52, 60 n.6 (2013) (holding that regardless of whether the plaintiff had protected rights, “no additional process was necessary. Classification of a crime as a ‘sexually violent offense’ under Code § 9.1</w:t>
-      </w:r>
-      <w:r>
-        <w:noBreakHyphen/>
-      </w:r>
-      <w:r>
-        <w:t xml:space="preserve">902 is based solely on the nature of the crime. Thus, conviction” of the offense “is the only fact relevant to the classification determination, and nothing Smith could have presented at a hearing would have changed that fact.”). Anderson’s procedural due process claim therefore fails.</w:t>
+        <w:t xml:space="preserve">52, 60 n.6 (2013) (holding that regardless of whether the plaintiff had protected rights, “no additional process was necessary. Classification of a crime as a ‘sexually violent offense’ under Code § 9.1-⁠902 is based solely on the nature of the crime. Thus, conviction” of the offense “is the only fact relevant to the classification determination, and nothing Smith could have presented at a hearing would have changed that fact.”). Anderson’s procedural due process claim therefore fails.</w:t>
       </w:r>
     </w:p>
     <w:p>
@@ -17872,7 +17755,7 @@
     </w:p>
     <w:p>
       <w:pPr>
-        <w:pStyle w:val="BodyText"/>
+        <w:pStyle w:val="BodyTextKeep"/>
       </w:pPr>
       <w:r>
         <w:t xml:space="preserve">For the foregoing reasons, this Court should affirm.</w:t>
@@ -17880,6 +17763,8 @@
     </w:p>
     <w:p>
       <w:pPr>
+        <w:keepNext/>
+        <w:keepLines/>
         <w:spacing w:before="0" w:after="0" w:line="336" w:lineRule="exact"/>
       </w:pPr>
     </w:p>
@@ -19510,7 +19395,7 @@
         <w:t xml:space="preserve"> </w:t>
       </w:r>
       <w:r>
-        <w:t xml:space="preserve">2023, https://​​tinyurl.​com/​​3ffa798x.</w:t>
+        <w:t xml:space="preserve">2023, https://​tinyurl.​com/​3ffa798x.</w:t>
       </w:r>
     </w:p>
   </w:footnote>
@@ -20700,6 +20585,15 @@
       <w:ind w:firstLine="0"/>
     </w:pPr>
   </w:style>
+  <w:style w:type="paragraph" w:customStyle="1" w:styleId="BodyTextKeep">
+    <w:name w:val="Body Text Keep"/>
+    <w:basedOn w:val="BodyText"/>
+    <w:qFormat/>
+    <w:pPr>
+      <w:keepNext/>
+      <w:keepLines/>
+    </w:pPr>
+  </w:style>
   <w:style w:type="paragraph" w:customStyle="1" w:styleId="XdList1">
     <w:name w:val="XdList 1"/>
     <w:basedOn w:val="Normal"/>
@@ -20752,6 +20646,33 @@
     <w:pPr>
       <w:spacing w:before="0" w:after="0" w:line="322" w:lineRule="exact"/>
       <w:ind w:left="2160" w:hanging="720"/>
+    </w:pPr>
+  </w:style>
+  <w:style w:type="paragraph" w:customStyle="1" w:styleId="XdQuoteList1">
+    <w:name w:val="Xd Quote List 1"/>
+    <w:basedOn w:val="Normal"/>
+    <w:qFormat/>
+    <w:pPr>
+      <w:spacing w:before="0" w:after="0" w:line="322" w:lineRule="exact"/>
+      <w:ind w:left="1440" w:right="720" w:hanging="720"/>
+    </w:pPr>
+  </w:style>
+  <w:style w:type="paragraph" w:customStyle="1" w:styleId="XdQuoteList2">
+    <w:name w:val="Xd Quote List 2"/>
+    <w:basedOn w:val="Normal"/>
+    <w:qFormat/>
+    <w:pPr>
+      <w:spacing w:before="0" w:after="0" w:line="322" w:lineRule="exact"/>
+      <w:ind w:left="2160" w:right="720" w:hanging="720"/>
+    </w:pPr>
+  </w:style>
+  <w:style w:type="paragraph" w:customStyle="1" w:styleId="XdQuoteList3">
+    <w:name w:val="Xd Quote List 3"/>
+    <w:basedOn w:val="Normal"/>
+    <w:qFormat/>
+    <w:pPr>
+      <w:spacing w:before="0" w:after="0" w:line="322" w:lineRule="exact"/>
+      <w:ind w:left="2880" w:right="720" w:hanging="720"/>
     </w:pPr>
   </w:style>
   <w:style w:type="paragraph" w:customStyle="1" w:styleId="XdList1">

</xml_diff>